<commit_message>
Refresh portfolio content and accessibility
</commit_message>
<xml_diff>
--- a/Edited_Curriculum_Vitae.docx
+++ b/Edited_Curriculum_Vitae.docx
@@ -250,7 +250,7 @@
           <w:bCs/>
           <w:b/>
         </w:rPr>
-        <w:t xml:space="preserve">German Aerospace Agency (DLR)</w:t>
+        <w:t>German Aerospace Center (DLR)</w:t>
       </w:r>
       <w:r>
         <w:t xml:space="preserve">, Cologne – intern, April to May 2022</w:t>
@@ -275,7 +275,7 @@
           <w:bCs/>
           <w:b/>
         </w:rPr>
-        <w:t xml:space="preserve">EUMETSAT</w:t>
+        <w:t>European Organisation for the Exploitation of Meteorological Satellites (EUMETSAT)</w:t>
       </w:r>
       <w:r>
         <w:t xml:space="preserve">, Darmstadt – intern, March to April 2022</w:t>
@@ -412,19 +412,47 @@
           <w:bCs/>
           <w:b/>
         </w:rPr>
-        <w:t xml:space="preserve">Skyrunners UAV Club, Stanford</w:t>
+        <w:t>Stanford Swift Solar Plane Project</w:t>
       </w:r>
       <w:r>
         <w:t xml:space="preserve"> </w:t>
       </w:r>
       <w:r>
-        <w:t xml:space="preserve">– project team member, 2025 to present</w:t>
+        <w:t>– engineering team member, 2026 to present</w:t>
       </w:r>
       <w:r>
         <w:br/>
       </w:r>
       <w:r>
-        <w:t xml:space="preserve">Designing and building an autonomous food delivery drone.</w:t>
+        <w:t>Contributing to a solar-powered aircraft more than five meters in wingspan, targeting autonomous multi-day flight and the world record for continuous electric flight.</w:t>
+      </w:r>
+    </w:p>
+    <w:p>
+      <w:pPr>
+        <w:numPr>
+          <w:ilvl w:val="0"/>
+          <w:numId w:val="1002"/>
+        </w:numPr>
+        <w:pStyle w:val="Compact"/>
+      </w:pPr>
+      <w:r>
+        <w:rPr>
+          <w:bCs/>
+          <w:b/>
+        </w:rPr>
+        <w:t>SkyRunners UAV Club, Stanford</w:t>
+      </w:r>
+      <w:r>
+        <w:t xml:space="preserve"> </w:t>
+      </w:r>
+      <w:r>
+        <w:t>– project team member, 2025 to 2026</w:t>
+      </w:r>
+      <w:r>
+        <w:br/>
+      </w:r>
+      <w:r>
+        <w:t>Designed and built an autonomous food-delivery drone as part of the Stanford team.</w:t>
       </w:r>
     </w:p>
     <w:bookmarkEnd w:id="21"/>

</xml_diff>